<commit_message>
Documenta pendencias e evidencias externas
</commit_message>
<xml_diff>
--- a/Analise/relatorio_final_hermex_log.docx
+++ b/Analise/relatorio_final_hermex_log.docx
@@ -1670,6 +1670,651 @@
       <w:r>
         <w:rPr/>
         <w:t xml:space="preserve">[x] Documentar vantagem dos dados semânticos sobre dados brutos</w:t>
+      </w:r>
+    </w:p>
+    <w:p>
+      <w:r>
+        <w:br w:type="page"/>
+      </w:r>
+    </w:p>
+    <w:p>
+      <w:pPr>
+        <w:pStyle w:val="Heading1"/>
+      </w:pPr>
+      <w:r>
+        <w:rPr/>
+        <w:t xml:space="preserve">10. Pendências externas e evidências</w:t>
+      </w:r>
+    </w:p>
+    <w:p>
+      <w:pPr/>
+      <w:r>
+        <w:rPr/>
+        <w:t xml:space="preserve">Esta seção registra tudo que ainda depende de execução em plataformas externas. O material local foi preparado, testado quando possível e publicado no repositório, mas não se deve confundir especificação ou arquivo importável com publicação efetiva em uma conta SaaS.</w:t>
+      </w:r>
+    </w:p>
+    <w:p>
+      <w:pPr>
+        <w:pStyle w:val="Heading2"/>
+      </w:pPr>
+      <w:r>
+        <w:rPr/>
+        <w:t xml:space="preserve">10.1 Miro</w:t>
+      </w:r>
+    </w:p>
+    <w:p>
+      <w:pPr/>
+      <w:r>
+        <w:rPr>
+          <w:b/>
+        </w:rPr>
+        <w:t xml:space="preserve">Pendente:</w:t>
+      </w:r>
+      <w:r>
+        <w:rPr/>
+        <w:t xml:space="preserve"> criar o fluxograma diretamente em um board do Miro.</w:t>
+      </w:r>
+    </w:p>
+    <w:p>
+      <w:pPr/>
+      <w:r>
+        <w:rPr>
+          <w:b/>
+        </w:rPr>
+        <w:t xml:space="preserve">Motivo:</w:t>
+      </w:r>
+      <w:r>
+        <w:rPr/>
+        <w:t xml:space="preserve"> não houve acesso autenticado ao workspace ou ao board.</w:t>
+      </w:r>
+    </w:p>
+    <w:p>
+      <w:pPr/>
+      <w:r>
+        <w:rPr>
+          <w:b/>
+        </w:rPr>
+        <w:t xml:space="preserve">Necessário:</w:t>
+      </w:r>
+      <w:r>
+        <w:rPr/>
+        <w:t xml:space="preserve"> link do board com permissão de edição e indicação do local onde o fluxo deve ser inserido.</w:t>
+      </w:r>
+    </w:p>
+    <w:p>
+      <w:pPr/>
+      <w:r>
+        <w:rPr>
+          <w:b/>
+        </w:rPr>
+        <w:t xml:space="preserve">Evidência local:</w:t>
+      </w:r>
+      <w:r>
+        <w:rPr/>
+        <w:t xml:space="preserve"> [artefatos/02_fluxo_pos_venda.mmd](../artefatos/02_fluxo_pos_venda.mmd), contendo início, fim, atividades, decisões, looping e critérios de automação.</w:t>
+      </w:r>
+    </w:p>
+    <w:p>
+      <w:pPr>
+        <w:pStyle w:val="Heading2"/>
+      </w:pPr>
+      <w:r>
+        <w:rPr/>
+        <w:t xml:space="preserve">10.2 Google Sheets</w:t>
+      </w:r>
+    </w:p>
+    <w:p>
+      <w:pPr/>
+      <w:r>
+        <w:rPr>
+          <w:b/>
+        </w:rPr>
+        <w:t xml:space="preserve">Pendente:</w:t>
+      </w:r>
+      <w:r>
+        <w:rPr/>
+        <w:t xml:space="preserve"> criar ou abrir a planilha online, importar os datasets e criar a aba </w:t>
+      </w:r>
+      <w:r>
+        <w:rPr/>
+        <w:t xml:space="preserve">Matriz RACI</w:t>
+      </w:r>
+      <w:r>
+        <w:rPr/>
+        <w:t xml:space="preserve">.</w:t>
+      </w:r>
+    </w:p>
+    <w:p>
+      <w:pPr/>
+      <w:r>
+        <w:rPr>
+          <w:b/>
+        </w:rPr>
+        <w:t xml:space="preserve">Motivo:</w:t>
+      </w:r>
+      <w:r>
+        <w:rPr/>
+        <w:t xml:space="preserve"> não houve acesso autenticado à conta Google.</w:t>
+      </w:r>
+    </w:p>
+    <w:p>
+      <w:pPr/>
+      <w:r>
+        <w:rPr>
+          <w:b/>
+        </w:rPr>
+        <w:t xml:space="preserve">Necessário:</w:t>
+      </w:r>
+      <w:r>
+        <w:rPr/>
+        <w:t xml:space="preserve"> planilha com permissão de edição e confirmação dos nomes das abas.</w:t>
+      </w:r>
+    </w:p>
+    <w:p>
+      <w:pPr/>
+      <w:r>
+        <w:rPr>
+          <w:b/>
+        </w:rPr>
+        <w:t xml:space="preserve">Evidências locais:</w:t>
+      </w:r>
+      <w:r>
+        <w:rPr/>
+        <w:t xml:space="preserve"> [dados/handoff_vendas_posvenda.csv](../dados/handoff_vendas_posvenda.csv), [dados/pesquisa_satisfacao.csv](../dados/pesquisa_satisfacao.csv) e [artefatos/03_matriz_raci.csv](../artefatos/03_matriz_raci.csv). O handoff contém 30 pedidos, 10 campos obrigatórios e nenhuma linha incompleta.</w:t>
+      </w:r>
+    </w:p>
+    <w:p>
+      <w:pPr>
+        <w:pStyle w:val="Heading2"/>
+      </w:pPr>
+      <w:r>
+        <w:rPr/>
+        <w:t xml:space="preserve">10.3 Google Forms</w:t>
+      </w:r>
+    </w:p>
+    <w:p>
+      <w:pPr/>
+      <w:r>
+        <w:rPr>
+          <w:b/>
+        </w:rPr>
+        <w:t xml:space="preserve">Pendente:</w:t>
+      </w:r>
+      <w:r>
+        <w:rPr/>
+        <w:t xml:space="preserve"> criar o formulário com </w:t>
+      </w:r>
+      <w:r>
+        <w:rPr/>
+        <w:t xml:space="preserve">ID do Pedido</w:t>
+      </w:r>
+      <w:r>
+        <w:rPr/>
+        <w:t xml:space="preserve">, </w:t>
+      </w:r>
+      <w:r>
+        <w:rPr/>
+        <w:t xml:space="preserve">Nota NPS (0-10)</w:t>
+      </w:r>
+      <w:r>
+        <w:rPr/>
+        <w:t xml:space="preserve"> e </w:t>
+      </w:r>
+      <w:r>
+        <w:rPr/>
+        <w:t xml:space="preserve">Comentário</w:t>
+      </w:r>
+      <w:r>
+        <w:rPr/>
+        <w:t xml:space="preserve">, vinculando as respostas à planilha.</w:t>
+      </w:r>
+    </w:p>
+    <w:p>
+      <w:pPr/>
+      <w:r>
+        <w:rPr>
+          <w:b/>
+        </w:rPr>
+        <w:t xml:space="preserve">Motivo:</w:t>
+      </w:r>
+      <w:r>
+        <w:rPr/>
+        <w:t xml:space="preserve"> depende de acesso à conta Google e à planilha de destino.</w:t>
+      </w:r>
+    </w:p>
+    <w:p>
+      <w:pPr/>
+      <w:r>
+        <w:rPr>
+          <w:b/>
+        </w:rPr>
+        <w:t xml:space="preserve">Necessário:</w:t>
+      </w:r>
+      <w:r>
+        <w:rPr/>
+        <w:t xml:space="preserve"> conta Google com permissão de edição e confirmação do nome do formulário.</w:t>
+      </w:r>
+    </w:p>
+    <w:p>
+      <w:pPr>
+        <w:pStyle w:val="Heading2"/>
+      </w:pPr>
+      <w:r>
+        <w:rPr/>
+        <w:t xml:space="preserve">10.4 n8n, Gemini e Gmail</w:t>
+      </w:r>
+    </w:p>
+    <w:p>
+      <w:pPr/>
+      <w:r>
+        <w:rPr>
+          <w:b/>
+        </w:rPr>
+        <w:t xml:space="preserve">Pendente:</w:t>
+      </w:r>
+      <w:r>
+        <w:rPr/>
+        <w:t xml:space="preserve"> configurar o gatilho real do Google Sheets, Pin Data, nó Gemini, nós Gmail e executar os testes reais de detrator e promotor.</w:t>
+      </w:r>
+    </w:p>
+    <w:p>
+      <w:pPr/>
+      <w:r>
+        <w:rPr>
+          <w:b/>
+        </w:rPr>
+        <w:t xml:space="preserve">Motivo:</w:t>
+      </w:r>
+      <w:r>
+        <w:rPr/>
+        <w:t xml:space="preserve"> o workspace n8n e as credenciais Google/Gemini não estavam disponíveis. O workflow local foi mantido inativo para não enviar mensagens ou usar credenciais reais.</w:t>
+      </w:r>
+    </w:p>
+    <w:p>
+      <w:pPr/>
+      <w:r>
+        <w:rPr>
+          <w:b/>
+        </w:rPr>
+        <w:t xml:space="preserve">Necessário:</w:t>
+      </w:r>
+      <w:r>
+        <w:rPr/>
+        <w:t xml:space="preserve"> URL e acesso ao workspace n8n, credenciais configuradas diretamente na plataforma, chave Gemini inserida no n8n e uma caixa de e-mail de teste.</w:t>
+      </w:r>
+    </w:p>
+    <w:p>
+      <w:pPr/>
+      <w:r>
+        <w:rPr>
+          <w:b/>
+        </w:rPr>
+        <w:t xml:space="preserve">Evidências locais:</w:t>
+      </w:r>
+      <w:r>
+        <w:rPr/>
+        <w:t xml:space="preserve"> [artefatos/05_n8n_workflow.json](../artefatos/05_n8n_workflow.json) e [artefatos/05_n8n_configuracao_producao.md](../artefatos/05_n8n_configuracao_producao.md). O JSON possui o workflow </w:t>
+      </w:r>
+      <w:r>
+        <w:rPr/>
+        <w:t xml:space="preserve">Hermex — NPS Automação</w:t>
+      </w:r>
+      <w:r>
+        <w:rPr/>
+        <w:t xml:space="preserve">, ramificação para nota menor que 6, classificação fechada, caminho de agradecimento e portão de aprovação humana.</w:t>
+      </w:r>
+    </w:p>
+    <w:p>
+      <w:pPr/>
+      <w:r>
+        <w:rPr>
+          <w:b/>
+        </w:rPr>
+        <w:t xml:space="preserve">Limite:</w:t>
+      </w:r>
+      <w:r>
+        <w:rPr/>
+        <w:t xml:space="preserve"> os arquivos locais comprovam o desenho e a preparação, não comprovam envio de e-mails nem execução no n8n online.</w:t>
+      </w:r>
+    </w:p>
+    <w:p>
+      <w:pPr>
+        <w:pStyle w:val="Heading2"/>
+      </w:pPr>
+      <w:r>
+        <w:rPr/>
+        <w:t xml:space="preserve">10.5 Looker Studio</w:t>
+      </w:r>
+    </w:p>
+    <w:p>
+      <w:pPr/>
+      <w:r>
+        <w:rPr>
+          <w:b/>
+        </w:rPr>
+        <w:t xml:space="preserve">Pendente:</w:t>
+      </w:r>
+      <w:r>
+        <w:rPr/>
+        <w:t xml:space="preserve"> conectar a fonte online, ajustar tipos, criar os campos calculados e montar as quatro visualizações.</w:t>
+      </w:r>
+    </w:p>
+    <w:p>
+      <w:pPr/>
+      <w:r>
+        <w:rPr>
+          <w:b/>
+        </w:rPr>
+        <w:t xml:space="preserve">Motivo:</w:t>
+      </w:r>
+      <w:r>
+        <w:rPr/>
+        <w:t xml:space="preserve"> a planilha online e a conta Google autenticada não estavam disponíveis.</w:t>
+      </w:r>
+    </w:p>
+    <w:p>
+      <w:pPr/>
+      <w:r>
+        <w:rPr>
+          <w:b/>
+        </w:rPr>
+        <w:t xml:space="preserve">Necessário:</w:t>
+      </w:r>
+      <w:r>
+        <w:rPr/>
+        <w:t xml:space="preserve"> acesso de edição ao Looker Studio e à planilha </w:t>
+      </w:r>
+      <w:r>
+        <w:rPr/>
+        <w:t xml:space="preserve">pesquisa_satisfacao</w:t>
+      </w:r>
+      <w:r>
+        <w:rPr/>
+        <w:t xml:space="preserve">.</w:t>
+      </w:r>
+    </w:p>
+    <w:p>
+      <w:pPr/>
+      <w:r>
+        <w:rPr>
+          <w:b/>
+        </w:rPr>
+        <w:t xml:space="preserve">Evidência local:</w:t>
+      </w:r>
+      <w:r>
+        <w:rPr/>
+        <w:t xml:space="preserve"> [artefatos/06_looker_studio.md](../artefatos/06_looker_studio.md), com tipos de dados, NPS em porcentagem, médias de dias, scorecards, mapa, barras e tabela.</w:t>
+      </w:r>
+    </w:p>
+    <w:p>
+      <w:pPr>
+        <w:pStyle w:val="Heading2"/>
+      </w:pPr>
+      <w:r>
+        <w:rPr/>
+        <w:t xml:space="preserve">10.6 Notion</w:t>
+      </w:r>
+    </w:p>
+    <w:p>
+      <w:pPr/>
+      <w:r>
+        <w:rPr>
+          <w:b/>
+        </w:rPr>
+        <w:t xml:space="preserve">Pendente:</w:t>
+      </w:r>
+      <w:r>
+        <w:rPr/>
+        <w:t xml:space="preserve"> criar o database </w:t>
+      </w:r>
+      <w:r>
+        <w:rPr/>
+        <w:t xml:space="preserve">Processos Hermex Log</w:t>
+      </w:r>
+      <w:r>
+        <w:rPr/>
+        <w:t xml:space="preserve"> e as páginas de Política de Devolução, Processo de Reembolso e SLA de Entrega por Região.</w:t>
+      </w:r>
+    </w:p>
+    <w:p>
+      <w:pPr/>
+      <w:r>
+        <w:rPr>
+          <w:b/>
+        </w:rPr>
+        <w:t xml:space="preserve">Motivo:</w:t>
+      </w:r>
+      <w:r>
+        <w:rPr/>
+        <w:t xml:space="preserve"> não houve acesso autenticado ao workspace Notion.</w:t>
+      </w:r>
+    </w:p>
+    <w:p>
+      <w:pPr/>
+      <w:r>
+        <w:rPr>
+          <w:b/>
+        </w:rPr>
+        <w:t xml:space="preserve">Necessário:</w:t>
+      </w:r>
+      <w:r>
+        <w:rPr/>
+        <w:t xml:space="preserve"> link da página pai ou workspace, permissão de edição e responsáveis oficiais.</w:t>
+      </w:r>
+    </w:p>
+    <w:p>
+      <w:pPr/>
+      <w:r>
+        <w:rPr>
+          <w:b/>
+        </w:rPr>
+        <w:t xml:space="preserve">Evidência local:</w:t>
+      </w:r>
+      <w:r>
+        <w:rPr/>
+        <w:t xml:space="preserve"> [artefatos/07_notion_base_conhecimento.md](../artefatos/07_notion_base_conhecimento.md), com as três páginas e as faixas regionais de SLA.</w:t>
+      </w:r>
+    </w:p>
+    <w:p>
+      <w:pPr>
+        <w:pStyle w:val="Heading2"/>
+      </w:pPr>
+      <w:r>
+        <w:rPr/>
+        <w:t xml:space="preserve">10.7 Teste do GPT publicado</w:t>
+      </w:r>
+    </w:p>
+    <w:p>
+      <w:pPr/>
+      <w:r>
+        <w:rPr>
+          <w:b/>
+        </w:rPr>
+        <w:t xml:space="preserve">Pendente:</w:t>
+      </w:r>
+      <w:r>
+        <w:rPr/>
+        <w:t xml:space="preserve"> repetir os cenários SP, BA e AM dentro de um GPT publicado no GPT Builder.</w:t>
+      </w:r>
+    </w:p>
+    <w:p>
+      <w:pPr/>
+      <w:r>
+        <w:rPr>
+          <w:b/>
+        </w:rPr>
+        <w:t xml:space="preserve">Motivo:</w:t>
+      </w:r>
+      <w:r>
+        <w:rPr/>
+        <w:t xml:space="preserve"> o acesso ao GPT Builder não estava disponível.</w:t>
+      </w:r>
+    </w:p>
+    <w:p>
+      <w:pPr/>
+      <w:r>
+        <w:rPr>
+          <w:b/>
+        </w:rPr>
+        <w:t xml:space="preserve">Evidência local:</w:t>
+      </w:r>
+      <w:r>
+        <w:rPr/>
+        <w:t xml:space="preserve"> [artefatos/09_testes_assistente_prazos.md](../artefatos/09_testes_assistente_prazos.md), com os três resultados observados no motor local. Os testes retornaram as regiões corretas, prazo de 5 a 5 dias corridos e observação operacional.</w:t>
+      </w:r>
+    </w:p>
+    <w:p>
+      <w:pPr/>
+      <w:r>
+        <w:rPr>
+          <w:b/>
+        </w:rPr>
+        <w:t xml:space="preserve">Limite:</w:t>
+      </w:r>
+      <w:r>
+        <w:rPr/>
+        <w:t xml:space="preserve"> a evidência local não equivale a uma captura ou execução dentro do GPT Builder.</w:t>
+      </w:r>
+    </w:p>
+    <w:p>
+      <w:pPr>
+        <w:pStyle w:val="Heading2"/>
+      </w:pPr>
+      <w:r>
+        <w:rPr/>
+        <w:t xml:space="preserve">10.8 Requisitos gerais para concluir as pendências</w:t>
+      </w:r>
+    </w:p>
+    <w:p>
+      <w:pPr>
+        <w:pStyle w:val="ListBullet"/>
+      </w:pPr>
+      <w:r>
+        <w:rPr/>
+        <w:t xml:space="preserve">acesso autenticado às contas Miro, Google, n8n, Notion e GPT Builder</w:t>
+      </w:r>
+    </w:p>
+    <w:p>
+      <w:pPr>
+        <w:pStyle w:val="ListBullet"/>
+      </w:pPr>
+      <w:r>
+        <w:rPr/>
+        <w:t xml:space="preserve">permissões de edição nos recursos correspondentes</w:t>
+      </w:r>
+    </w:p>
+    <w:p>
+      <w:pPr>
+        <w:pStyle w:val="ListBullet"/>
+      </w:pPr>
+      <w:r>
+        <w:rPr/>
+        <w:t xml:space="preserve">definição das caixas de e-mail de teste e operacionais</w:t>
+      </w:r>
+    </w:p>
+    <w:p>
+      <w:pPr>
+        <w:pStyle w:val="ListBullet"/>
+      </w:pPr>
+      <w:r>
+        <w:rPr/>
+        <w:t xml:space="preserve">credencial Gemini configurada diretamente no n8n</w:t>
+      </w:r>
+    </w:p>
+    <w:p>
+      <w:pPr>
+        <w:pStyle w:val="ListBullet"/>
+      </w:pPr>
+      <w:r>
+        <w:rPr/>
+        <w:t xml:space="preserve">autorização para executar testes e gerar evidências externas</w:t>
+      </w:r>
+    </w:p>
+    <w:p>
+      <w:pPr>
+        <w:pStyle w:val="ListBullet"/>
+      </w:pPr>
+      <w:r>
+        <w:rPr/>
+        <w:t xml:space="preserve">links, capturas ou exportações das plataformas após a execução</w:t>
+      </w:r>
+    </w:p>
+    <w:p>
+      <w:pPr/>
+      <w:r>
+        <w:rPr/>
+        <w:t xml:space="preserve">Segredos, senhas, tokens e chaves de API não devem ser enviados pelo chat. Devem ser inseridos diretamente nos campos de credenciais das plataformas.</w:t>
+      </w:r>
+    </w:p>
+    <w:p>
+      <w:pPr>
+        <w:pStyle w:val="Heading2"/>
+      </w:pPr>
+      <w:r>
+        <w:rPr/>
+        <w:t xml:space="preserve">10.9 Evidências de conclusão local</w:t>
+      </w:r>
+    </w:p>
+    <w:p>
+      <w:pPr>
+        <w:pStyle w:val="ListBullet"/>
+      </w:pPr>
+      <w:r>
+        <w:rPr/>
+        <w:t xml:space="preserve">testes automatizados: 9 aprovados e 0 falhas</w:t>
+      </w:r>
+    </w:p>
+    <w:p>
+      <w:pPr>
+        <w:pStyle w:val="ListBullet"/>
+      </w:pPr>
+      <w:r>
+        <w:rPr/>
+        <w:t xml:space="preserve">três cenários do assistente executados localmente: SP, BA e AM</w:t>
+      </w:r>
+    </w:p>
+    <w:p>
+      <w:pPr>
+        <w:pStyle w:val="ListBullet"/>
+      </w:pPr>
+      <w:r>
+        <w:rPr/>
+        <w:t xml:space="preserve">dataset de handoff validado: 30 pedidos, 10 campos obrigatórios e 0 linhas incompletas</w:t>
+      </w:r>
+    </w:p>
+    <w:p>
+      <w:pPr>
+        <w:pStyle w:val="ListBullet"/>
+      </w:pPr>
+      <w:r>
+        <w:rPr/>
+        <w:t xml:space="preserve">workflow n8n local preparado e inativo</w:t>
+      </w:r>
+    </w:p>
+    <w:p>
+      <w:pPr>
+        <w:pStyle w:val="ListBullet"/>
+      </w:pPr>
+      <w:r>
+        <w:rPr/>
+        <w:t xml:space="preserve">relatório Word gerado em </w:t>
+      </w:r>
+      <w:r>
+        <w:rPr/>
+        <w:t xml:space="preserve">Analise/relatorio_final_hermex_log.docx</w:t>
+      </w:r>
+    </w:p>
+    <w:p>
+      <w:pPr>
+        <w:pStyle w:val="ListBullet"/>
+      </w:pPr>
+      <w:r>
+        <w:rPr/>
+        <w:t xml:space="preserve">repositório publicado na branch </w:t>
+      </w:r>
+      <w:r>
+        <w:rPr/>
+        <w:t xml:space="preserve">main</w:t>
       </w:r>
     </w:p>
     <w:p>

</xml_diff>